<commit_message>
Update E6 documentation and add AP3 MCD
</commit_message>
<xml_diff>
--- a/AP3_Gestion_Produit_API/docs/e6/Annexe_VII_1_B_AP3_Gestion_Produits_API_Mobile_remplie.docx
+++ b/AP3_Gestion_Produit_API/docs/e6/Annexe_VII_1_B_AP3_Gestion_Produits_API_Mobile_remplie.docx
@@ -755,77 +755,123 @@
             </w:tcBorders>
           </w:tcPr>
           <w:p>
-            <w:r/>
+            <w:pPr>
+              <w:spacing w:after="0" w:before="0" w:line="228" w:lineRule="auto"/>
+            </w:pPr>
             <w:r>
               <w:rPr>
                 <w:b/>
-                <w:sz w:val="14"/>
+                <w:sz w:val="13"/>
               </w:rPr>
               <w:t>Modalites d'acces aux productions et a leur documentation</w:t>
             </w:r>
           </w:p>
           <w:p>
-            <w:r>
-              <w:rPr>
-                <w:sz w:val="14"/>
-              </w:rPr>
-              <w:t>Code source API : C:\laragon\www\AP3_Gestion_Produit_api.</w:t>
-            </w:r>
-          </w:p>
-          <w:p>
-            <w:r>
-              <w:rPr>
-                <w:sz w:val="14"/>
-              </w:rPr>
-              <w:t>Code source mobile : C:\Users\medhi\AndroidStudioProjects\ApiMobile.</w:t>
-            </w:r>
-          </w:p>
-          <w:p>
-            <w:r>
-              <w:rPr>
-                <w:sz w:val="14"/>
-              </w:rPr>
-              <w:t>Base de donnees : gestion_produits accessible via phpMyAdmin / MySQL root sans mot de passe en local.</w:t>
-            </w:r>
-          </w:p>
-          <w:p>
-            <w:r>
-              <w:rPr>
-                <w:sz w:val="14"/>
-              </w:rPr>
-              <w:t>URL API locale : http://localhost:8080/AP3_Gestion_Produit_api/public/</w:t>
-            </w:r>
-          </w:p>
-          <w:p>
-            <w:r>
-              <w:rPr>
-                <w:sz w:val="14"/>
-              </w:rPr>
-              <w:t>URL API depuis emulateur Android : http://10.0.2.2:8080/AP3_Gestion_Produit_api/public/</w:t>
-            </w:r>
-          </w:p>
-          <w:p>
-            <w:r>
-              <w:rPr>
-                <w:sz w:val="14"/>
-              </w:rPr>
-              <w:t>Endpoints principaux : POST /api/login, GET /api/produits, GET/POST /api/panier, GET/POST /api/commandes, GET /api/admin/stats, GET /api/admin/utilisateurs.</w:t>
-            </w:r>
-          </w:p>
-          <w:p>
-            <w:r>
-              <w:rPr>
-                <w:sz w:val="14"/>
-              </w:rPr>
-              <w:t>Comptes de test : admin jean.dupont@example.com / azerty123 ; utilisateur marie.durand@example.com / mdp123.</w:t>
-            </w:r>
-          </w:p>
-          <w:p>
-            <w:r>
-              <w:rPr>
-                <w:sz w:val="14"/>
-              </w:rPr>
-              <w:t>Documentation complementaire : C:\Users\medhi\Downloads\Document_unique_E6_AP1_Gestion_Produits_API_Mobile.docx.</w:t>
+            <w:pPr>
+              <w:spacing w:after="0" w:before="0" w:line="228" w:lineRule="auto"/>
+            </w:pPr>
+            <w:r>
+              <w:rPr>
+                <w:b w:val="0"/>
+                <w:sz w:val="13"/>
+              </w:rPr>
+              <w:t>Depot GitHub : https://github.com/medhiboudechicha/Epreuve-E6</w:t>
+            </w:r>
+          </w:p>
+          <w:p>
+            <w:pPr>
+              <w:spacing w:after="0" w:before="0" w:line="228" w:lineRule="auto"/>
+            </w:pPr>
+            <w:r>
+              <w:rPr>
+                <w:b w:val="0"/>
+                <w:sz w:val="13"/>
+              </w:rPr>
+              <w:t>Projet AP3 complet : les dossiers AP3_Gestion_Produit_API/ et AP3_ApiMobile_Android/ vont ensemble.</w:t>
+            </w:r>
+          </w:p>
+          <w:p>
+            <w:pPr>
+              <w:spacing w:after="0" w:before="0" w:line="228" w:lineRule="auto"/>
+            </w:pPr>
+            <w:r>
+              <w:rPr>
+                <w:b w:val="0"/>
+                <w:sz w:val="13"/>
+              </w:rPr>
+              <w:t>API backend : AP3_Gestion_Produit_API/ (CodeIgniter 4, routes REST, images, README d'installation).</w:t>
+            </w:r>
+          </w:p>
+          <w:p>
+            <w:pPr>
+              <w:spacing w:after="0" w:before="0" w:line="228" w:lineRule="auto"/>
+            </w:pPr>
+            <w:r>
+              <w:rPr>
+                <w:b w:val="0"/>
+                <w:sz w:val="13"/>
+              </w:rPr>
+              <w:t>Application mobile : AP3_ApiMobile_Android/ (projet Android Studio, README d'import et de liaison API).</w:t>
+            </w:r>
+          </w:p>
+          <w:p>
+            <w:pPr>
+              <w:spacing w:after="0" w:before="0" w:line="228" w:lineRule="auto"/>
+            </w:pPr>
+            <w:r>
+              <w:rPr>
+                <w:b w:val="0"/>
+                <w:sz w:val="13"/>
+              </w:rPr>
+              <w:t>Base MySQL : AP3_Gestion_Produit_API/bdd/gestion_produits.sql, importable avec phpMyAdmin.</w:t>
+            </w:r>
+          </w:p>
+          <w:p>
+            <w:pPr>
+              <w:spacing w:after="0" w:before="0" w:line="228" w:lineRule="auto"/>
+            </w:pPr>
+            <w:r>
+              <w:rPr>
+                <w:b w:val="0"/>
+                <w:sz w:val="13"/>
+              </w:rPr>
+              <w:t>MCD Looping : AP3_Gestion_Produit_API/bdd/mcd_ap3_gestion_produits_api.loo ; explications dans bdd/MCD.md.</w:t>
+            </w:r>
+          </w:p>
+          <w:p>
+            <w:pPr>
+              <w:spacing w:after="0" w:before="0" w:line="228" w:lineRule="auto"/>
+            </w:pPr>
+            <w:r>
+              <w:rPr>
+                <w:b w:val="0"/>
+                <w:sz w:val="13"/>
+              </w:rPr>
+              <w:t>Documentation : README racine, README API, README Android et AP3_Gestion_Produit_API/bdd/README.md.</w:t>
+            </w:r>
+          </w:p>
+          <w:p>
+            <w:pPr>
+              <w:spacing w:after="0" w:before="0" w:line="228" w:lineRule="auto"/>
+            </w:pPr>
+            <w:r>
+              <w:rPr>
+                <w:b w:val="0"/>
+                <w:sz w:val="13"/>
+              </w:rPr>
+              <w:t>URL API PC : http://localhost:8080/AP3_Gestion_Produit_api/public/ ; emulateur : http://10.0.2.2:8080/AP3_Gestion_Produit_api/public/.</w:t>
+            </w:r>
+          </w:p>
+          <w:p>
+            <w:pPr>
+              <w:spacing w:after="0" w:before="0" w:line="228" w:lineRule="auto"/>
+            </w:pPr>
+            <w:r>
+              <w:rPr>
+                <w:b w:val="0"/>
+                <w:sz w:val="13"/>
+              </w:rPr>
+              <w:t>Comptes test : admin jean.dupont@example.com / azerty123 ; utilisateur marie.durand@example.com / mdp123.</w:t>
             </w:r>
           </w:p>
         </w:tc>

</xml_diff>